<commit_message>
removed docs temp file
</commit_message>
<xml_diff>
--- a/test-cases/testcases.docx
+++ b/test-cases/testcases.docx
@@ -195,7 +195,15 @@
         <w:t xml:space="preserve"> valid</w:t>
       </w:r>
       <w:r>
-        <w:t xml:space="preserve"> myezra account </w:t>
+        <w:t xml:space="preserve"> </w:t>
+      </w:r>
+      <w:proofErr w:type="spellStart"/>
+      <w:r>
+        <w:t>myezra</w:t>
+      </w:r>
+      <w:proofErr w:type="spellEnd"/>
+      <w:r>
+        <w:t xml:space="preserve"> account </w:t>
       </w:r>
       <w:r>
         <w:t>information</w:t>
@@ -347,8 +355,13 @@
       <w:r>
         <w:t>Validate pop up with following messages displayed -</w:t>
       </w:r>
-      <w:r>
-        <w:t>i)</w:t>
+      <w:proofErr w:type="spellStart"/>
+      <w:r>
+        <w:t>i</w:t>
+      </w:r>
+      <w:proofErr w:type="spellEnd"/>
+      <w:r>
+        <w:t>)</w:t>
       </w:r>
       <w:r>
         <w:rPr>
@@ -560,7 +573,15 @@
         <w:t xml:space="preserve">s a customer myself, always prefer to use </w:t>
       </w:r>
       <w:r>
-        <w:t xml:space="preserve">cards – debit or credit cards before I pick google pay/ apple pay / paypal, bank acc etc. That is why I believe this is </w:t>
+        <w:t xml:space="preserve">cards – debit or credit cards before I pick google pay/ apple pay / </w:t>
+      </w:r>
+      <w:proofErr w:type="spellStart"/>
+      <w:r>
+        <w:t>paypal</w:t>
+      </w:r>
+      <w:proofErr w:type="spellEnd"/>
+      <w:r>
+        <w:t xml:space="preserve">, bank acc etc. That is why I believe this is </w:t>
       </w:r>
       <w:r>
         <w:t xml:space="preserve">one of the </w:t>
@@ -653,7 +674,15 @@
         <w:t xml:space="preserve">1. </w:t>
       </w:r>
       <w:r>
-        <w:t xml:space="preserve">Customer Logs in to customer portal with valid myezra account </w:t>
+        <w:t xml:space="preserve">Customer Logs in to customer portal with valid </w:t>
+      </w:r>
+      <w:proofErr w:type="spellStart"/>
+      <w:r>
+        <w:t>myezra</w:t>
+      </w:r>
+      <w:proofErr w:type="spellEnd"/>
+      <w:r>
+        <w:t xml:space="preserve"> account </w:t>
       </w:r>
     </w:p>
     <w:p>
@@ -875,7 +904,15 @@
         <w:t xml:space="preserve">1. </w:t>
       </w:r>
       <w:r>
-        <w:t xml:space="preserve">Log in to customer portal with myezra account </w:t>
+        <w:t xml:space="preserve">Log in to customer portal with </w:t>
+      </w:r>
+      <w:proofErr w:type="spellStart"/>
+      <w:r>
+        <w:t>myezra</w:t>
+      </w:r>
+      <w:proofErr w:type="spellEnd"/>
+      <w:r>
+        <w:t xml:space="preserve"> account </w:t>
       </w:r>
     </w:p>
     <w:p>
@@ -1025,13 +1062,29 @@
         <w:spacing w:after="0"/>
       </w:pPr>
       <w:r>
-        <w:t xml:space="preserve">Actual Result: All available plans display on the ui with the header, price and </w:t>
+        <w:t xml:space="preserve">Actual Result: All available plans display on the </w:t>
+      </w:r>
+      <w:proofErr w:type="spellStart"/>
+      <w:r>
+        <w:t>ui</w:t>
+      </w:r>
+      <w:proofErr w:type="spellEnd"/>
+      <w:r>
+        <w:t xml:space="preserve"> with the header, price and </w:t>
       </w:r>
       <w:r>
         <w:t>include</w:t>
       </w:r>
       <w:r>
-        <w:t xml:space="preserve"> the description of items which are not included in the package and also information about items that are listed </w:t>
+        <w:t xml:space="preserve"> the description of items which are not included in the package </w:t>
+      </w:r>
+      <w:proofErr w:type="gramStart"/>
+      <w:r>
+        <w:t>and also</w:t>
+      </w:r>
+      <w:proofErr w:type="gramEnd"/>
+      <w:r>
+        <w:t xml:space="preserve"> information about items that are listed </w:t>
       </w:r>
       <w:r>
         <w:t>in</w:t>
@@ -1048,7 +1101,15 @@
         <w:t xml:space="preserve">Actual Result: </w:t>
       </w:r>
       <w:r>
-        <w:t xml:space="preserve">All the plans are available on the ui, all the included and excluded information are </w:t>
+        <w:t xml:space="preserve">All the plans are available on the </w:t>
+      </w:r>
+      <w:proofErr w:type="spellStart"/>
+      <w:r>
+        <w:t>ui</w:t>
+      </w:r>
+      <w:proofErr w:type="spellEnd"/>
+      <w:r>
+        <w:t xml:space="preserve">, all the included and excluded information are </w:t>
       </w:r>
       <w:r>
         <w:t xml:space="preserve">displayed on the plan section. </w:t>
@@ -1160,7 +1221,15 @@
         <w:t xml:space="preserve">Customer </w:t>
       </w:r>
       <w:r>
-        <w:t>has google pay</w:t>
+        <w:t xml:space="preserve">has </w:t>
+      </w:r>
+      <w:proofErr w:type="gramStart"/>
+      <w:r>
+        <w:t>google</w:t>
+      </w:r>
+      <w:proofErr w:type="gramEnd"/>
+      <w:r>
+        <w:t xml:space="preserve"> pay</w:t>
       </w:r>
       <w:r>
         <w:t xml:space="preserve"> acc</w:t>
@@ -1203,7 +1272,15 @@
         <w:t xml:space="preserve">1. </w:t>
       </w:r>
       <w:r>
-        <w:t xml:space="preserve">Customer Logs in to customer portal with valid myezra account </w:t>
+        <w:t xml:space="preserve">Customer Logs in to customer portal with valid </w:t>
+      </w:r>
+      <w:proofErr w:type="spellStart"/>
+      <w:r>
+        <w:t>myezra</w:t>
+      </w:r>
+      <w:proofErr w:type="spellEnd"/>
+      <w:r>
+        <w:t xml:space="preserve"> account </w:t>
       </w:r>
     </w:p>
     <w:p>
@@ -1219,23 +1296,44 @@
         <w:spacing w:after="0"/>
       </w:pPr>
       <w:r>
-        <w:t>3. Customer selects a plan from all available plans displayed on the ui and clicks on the Continue button to navigate to schedule scan page</w:t>
-      </w:r>
-    </w:p>
-    <w:p>
-      <w:pPr>
-        <w:spacing w:after="0"/>
-      </w:pPr>
-      <w:r>
-        <w:t>4. Customer selects “California” as the state from the dropdown, and all the available locations are displayed on the ui</w:t>
-      </w:r>
-    </w:p>
-    <w:p>
-      <w:pPr>
-        <w:spacing w:after="0"/>
-      </w:pPr>
-      <w:r>
-        <w:t>5. Customer selects North Irvine location and selects one available day  and time from the date picker</w:t>
+        <w:t xml:space="preserve">3. Customer selects a plan from all available plans displayed on the </w:t>
+      </w:r>
+      <w:proofErr w:type="spellStart"/>
+      <w:r>
+        <w:t>ui</w:t>
+      </w:r>
+      <w:proofErr w:type="spellEnd"/>
+      <w:r>
+        <w:t xml:space="preserve"> and clicks on the Continue button to navigate to schedule scan page</w:t>
+      </w:r>
+    </w:p>
+    <w:p>
+      <w:pPr>
+        <w:spacing w:after="0"/>
+      </w:pPr>
+      <w:r>
+        <w:t xml:space="preserve">4. Customer selects “California” as the state from the dropdown, and all the available locations are displayed on the </w:t>
+      </w:r>
+      <w:proofErr w:type="spellStart"/>
+      <w:r>
+        <w:t>ui</w:t>
+      </w:r>
+      <w:proofErr w:type="spellEnd"/>
+    </w:p>
+    <w:p>
+      <w:pPr>
+        <w:spacing w:after="0"/>
+      </w:pPr>
+      <w:r>
+        <w:t xml:space="preserve">5. Customer selects North Irvine location and selects one available </w:t>
+      </w:r>
+      <w:proofErr w:type="gramStart"/>
+      <w:r>
+        <w:t>day  and</w:t>
+      </w:r>
+      <w:proofErr w:type="gramEnd"/>
+      <w:r>
+        <w:t xml:space="preserve"> time from the date picker</w:t>
       </w:r>
     </w:p>
     <w:p>
@@ -1424,7 +1522,15 @@
         <w:t xml:space="preserve">1. </w:t>
       </w:r>
       <w:r>
-        <w:t xml:space="preserve">Customer Logs in to customer portal with valid myezra account </w:t>
+        <w:t xml:space="preserve">Customer Logs in to customer portal with valid </w:t>
+      </w:r>
+      <w:proofErr w:type="spellStart"/>
+      <w:r>
+        <w:t>myezra</w:t>
+      </w:r>
+      <w:proofErr w:type="spellEnd"/>
+      <w:r>
+        <w:t xml:space="preserve"> account </w:t>
       </w:r>
     </w:p>
     <w:p>
@@ -1468,7 +1574,15 @@
         <w:spacing w:after="0"/>
       </w:pPr>
       <w:r>
-        <w:t>5. Customer selects one available day  and time from the date picker</w:t>
+        <w:t xml:space="preserve">5. Customer selects one available </w:t>
+      </w:r>
+      <w:proofErr w:type="gramStart"/>
+      <w:r>
+        <w:t>day  and</w:t>
+      </w:r>
+      <w:proofErr w:type="gramEnd"/>
+      <w:r>
+        <w:t xml:space="preserve"> time from the date picker</w:t>
       </w:r>
     </w:p>
     <w:p>
@@ -1652,7 +1766,15 @@
         <w:t xml:space="preserve">1. </w:t>
       </w:r>
       <w:r>
-        <w:t xml:space="preserve">Customer Logs in to customer portal with valid myezra account </w:t>
+        <w:t xml:space="preserve">Customer Logs in to customer portal with valid </w:t>
+      </w:r>
+      <w:proofErr w:type="spellStart"/>
+      <w:r>
+        <w:t>myezra</w:t>
+      </w:r>
+      <w:proofErr w:type="spellEnd"/>
+      <w:r>
+        <w:t xml:space="preserve"> account </w:t>
       </w:r>
     </w:p>
     <w:p>
@@ -1688,8 +1810,13 @@
         <w:t>Florida</w:t>
       </w:r>
       <w:r>
-        <w:t>” as the state from the dropdown, and all the available locations are displayed on the ui</w:t>
-      </w:r>
+        <w:t xml:space="preserve">” as the state from the dropdown, and all the available locations are displayed on the </w:t>
+      </w:r>
+      <w:proofErr w:type="spellStart"/>
+      <w:r>
+        <w:t>ui</w:t>
+      </w:r>
+      <w:proofErr w:type="spellEnd"/>
     </w:p>
     <w:p>
       <w:pPr>
@@ -1842,7 +1969,14 @@
       </w:r>
       <w:r>
         <w:br/>
-        <w:t xml:space="preserve">Test Case Name: </w:t>
+      </w:r>
+      <w:proofErr w:type="spellStart"/>
+      <w:r>
+        <w:t>Test</w:t>
+      </w:r>
+      <w:proofErr w:type="spellEnd"/>
+      <w:r>
+        <w:t xml:space="preserve"> Case Name: </w:t>
       </w:r>
       <w:r>
         <w:t>Expired card</w:t>
@@ -1913,7 +2047,15 @@
         <w:t xml:space="preserve">1. </w:t>
       </w:r>
       <w:r>
-        <w:t xml:space="preserve">Customer Logs in to customer portal with valid myezra account </w:t>
+        <w:t xml:space="preserve">Customer Logs in to customer portal with valid </w:t>
+      </w:r>
+      <w:proofErr w:type="spellStart"/>
+      <w:r>
+        <w:t>myezra</w:t>
+      </w:r>
+      <w:proofErr w:type="spellEnd"/>
+      <w:r>
+        <w:t xml:space="preserve"> account </w:t>
       </w:r>
     </w:p>
     <w:p>
@@ -1929,23 +2071,44 @@
         <w:spacing w:after="0"/>
       </w:pPr>
       <w:r>
-        <w:t>3. Customer selects a plan from all available plans displayed on the ui and clicks on the Continue button to navigate to schedule scan page</w:t>
-      </w:r>
-    </w:p>
-    <w:p>
-      <w:pPr>
-        <w:spacing w:after="0"/>
-      </w:pPr>
-      <w:r>
-        <w:t>4. Customer selects “California” as the state from the dropdown, and all the available locations are displayed on the ui</w:t>
-      </w:r>
-    </w:p>
-    <w:p>
-      <w:pPr>
-        <w:spacing w:after="0"/>
-      </w:pPr>
-      <w:r>
-        <w:t>5. Customer selects North Irvine location and selects one available day  and time from the date picker</w:t>
+        <w:t xml:space="preserve">3. Customer selects a plan from all available plans displayed on the </w:t>
+      </w:r>
+      <w:proofErr w:type="spellStart"/>
+      <w:r>
+        <w:t>ui</w:t>
+      </w:r>
+      <w:proofErr w:type="spellEnd"/>
+      <w:r>
+        <w:t xml:space="preserve"> and clicks on the Continue button to navigate to schedule scan page</w:t>
+      </w:r>
+    </w:p>
+    <w:p>
+      <w:pPr>
+        <w:spacing w:after="0"/>
+      </w:pPr>
+      <w:r>
+        <w:t xml:space="preserve">4. Customer selects “California” as the state from the dropdown, and all the available locations are displayed on the </w:t>
+      </w:r>
+      <w:proofErr w:type="spellStart"/>
+      <w:r>
+        <w:t>ui</w:t>
+      </w:r>
+      <w:proofErr w:type="spellEnd"/>
+    </w:p>
+    <w:p>
+      <w:pPr>
+        <w:spacing w:after="0"/>
+      </w:pPr>
+      <w:r>
+        <w:t xml:space="preserve">5. Customer selects North Irvine location and selects one available </w:t>
+      </w:r>
+      <w:proofErr w:type="gramStart"/>
+      <w:r>
+        <w:t>day  and</w:t>
+      </w:r>
+      <w:proofErr w:type="gramEnd"/>
+      <w:r>
+        <w:t xml:space="preserve"> time from the date picker</w:t>
       </w:r>
     </w:p>
     <w:p>
@@ -2006,7 +2169,15 @@
         <w:t>a past date for the expiration date</w:t>
       </w:r>
       <w:r>
-        <w:t>, validate the following error message on the ui as “</w:t>
+        <w:t xml:space="preserve">, validate the following error message on the </w:t>
+      </w:r>
+      <w:proofErr w:type="spellStart"/>
+      <w:r>
+        <w:t>ui</w:t>
+      </w:r>
+      <w:proofErr w:type="spellEnd"/>
+      <w:r>
+        <w:t xml:space="preserve"> as “</w:t>
       </w:r>
       <w:r>
         <w:t>Your card’s expiration year is in the past.</w:t>
@@ -2027,8 +2198,13 @@
         <w:t>e</w:t>
       </w:r>
       <w:r>
-        <w:t>rror message should be displayed on ui</w:t>
-      </w:r>
+        <w:t xml:space="preserve">rror message should be displayed on </w:t>
+      </w:r>
+      <w:proofErr w:type="spellStart"/>
+      <w:r>
+        <w:t>ui</w:t>
+      </w:r>
+      <w:proofErr w:type="spellEnd"/>
     </w:p>
     <w:p>
       <w:pPr>
@@ -2055,7 +2231,15 @@
         <w:t xml:space="preserve">- </w:t>
       </w:r>
       <w:r>
-        <w:t>Following error will display on the ui “</w:t>
+        <w:t xml:space="preserve">Following error will display on the </w:t>
+      </w:r>
+      <w:proofErr w:type="spellStart"/>
+      <w:r>
+        <w:t>ui</w:t>
+      </w:r>
+      <w:proofErr w:type="spellEnd"/>
+      <w:r>
+        <w:t xml:space="preserve"> “</w:t>
       </w:r>
       <w:r>
         <w:t>Your card’s expiration year is in the past.</w:t>
@@ -2160,7 +2344,15 @@
         <w:t xml:space="preserve">1. </w:t>
       </w:r>
       <w:r>
-        <w:t xml:space="preserve">Customer Logs in to customer portal with valid myezra account </w:t>
+        <w:t xml:space="preserve">Customer Logs in to customer portal with valid </w:t>
+      </w:r>
+      <w:proofErr w:type="spellStart"/>
+      <w:r>
+        <w:t>myezra</w:t>
+      </w:r>
+      <w:proofErr w:type="spellEnd"/>
+      <w:r>
+        <w:t xml:space="preserve"> account </w:t>
       </w:r>
     </w:p>
     <w:p>
@@ -2176,7 +2368,15 @@
         <w:spacing w:after="0"/>
       </w:pPr>
       <w:r>
-        <w:t>3. Customer selects a plan from all available plans displayed on the ui and clicks on the Continue button to navigate to schedule scan page</w:t>
+        <w:t xml:space="preserve">3. Customer selects a plan from all available plans displayed on the </w:t>
+      </w:r>
+      <w:proofErr w:type="spellStart"/>
+      <w:r>
+        <w:t>ui</w:t>
+      </w:r>
+      <w:proofErr w:type="spellEnd"/>
+      <w:r>
+        <w:t xml:space="preserve"> and clicks on the Continue button to navigate to schedule scan page</w:t>
       </w:r>
     </w:p>
     <w:p>
@@ -2638,7 +2838,15 @@
         <w:t xml:space="preserve">1. </w:t>
       </w:r>
       <w:r>
-        <w:t xml:space="preserve">Log in to customer portal with myezra account </w:t>
+        <w:t xml:space="preserve">Log in to customer portal with </w:t>
+      </w:r>
+      <w:proofErr w:type="spellStart"/>
+      <w:r>
+        <w:t>myezra</w:t>
+      </w:r>
+      <w:proofErr w:type="spellEnd"/>
+      <w:r>
+        <w:t xml:space="preserve"> account </w:t>
       </w:r>
     </w:p>
     <w:p>
@@ -2886,7 +3094,15 @@
         <w:t xml:space="preserve">1. </w:t>
       </w:r>
       <w:r>
-        <w:t xml:space="preserve">Log in to customer portal with myezra account </w:t>
+        <w:t xml:space="preserve">Log in to customer portal with </w:t>
+      </w:r>
+      <w:proofErr w:type="spellStart"/>
+      <w:r>
+        <w:t>myezra</w:t>
+      </w:r>
+      <w:proofErr w:type="spellEnd"/>
+      <w:r>
+        <w:t xml:space="preserve"> account </w:t>
       </w:r>
     </w:p>
     <w:p>
@@ -2900,7 +3116,15 @@
         <w:t xml:space="preserve">. </w:t>
       </w:r>
       <w:r>
-        <w:t>Select a MRI scan as a package</w:t>
+        <w:t xml:space="preserve">Select </w:t>
+      </w:r>
+      <w:proofErr w:type="gramStart"/>
+      <w:r>
+        <w:t>a</w:t>
+      </w:r>
+      <w:proofErr w:type="gramEnd"/>
+      <w:r>
+        <w:t xml:space="preserve"> MRI scan as a package</w:t>
       </w:r>
     </w:p>
     <w:p>
@@ -3063,7 +3287,15 @@
         <w:t xml:space="preserve">1. </w:t>
       </w:r>
       <w:r>
-        <w:t xml:space="preserve">Log in to customer portal with myezra account </w:t>
+        <w:t xml:space="preserve">Log in to customer portal with </w:t>
+      </w:r>
+      <w:proofErr w:type="spellStart"/>
+      <w:r>
+        <w:t>myezra</w:t>
+      </w:r>
+      <w:proofErr w:type="spellEnd"/>
+      <w:r>
+        <w:t xml:space="preserve"> account </w:t>
       </w:r>
     </w:p>
     <w:p>
@@ -3252,7 +3484,15 @@
         <w:t xml:space="preserve">1. </w:t>
       </w:r>
       <w:r>
-        <w:t xml:space="preserve">Log in to customer portal with myezra account </w:t>
+        <w:t xml:space="preserve">Log in to customer portal with </w:t>
+      </w:r>
+      <w:proofErr w:type="spellStart"/>
+      <w:r>
+        <w:t>myezra</w:t>
+      </w:r>
+      <w:proofErr w:type="spellEnd"/>
+      <w:r>
+        <w:t xml:space="preserve"> account </w:t>
       </w:r>
     </w:p>
     <w:p>
@@ -3400,7 +3640,15 @@
         <w:t xml:space="preserve">1. </w:t>
       </w:r>
       <w:r>
-        <w:t xml:space="preserve">Log in to customer portal with myezra account </w:t>
+        <w:t xml:space="preserve">Log in to customer portal with </w:t>
+      </w:r>
+      <w:proofErr w:type="spellStart"/>
+      <w:r>
+        <w:t>myezra</w:t>
+      </w:r>
+      <w:proofErr w:type="spellEnd"/>
+      <w:r>
+        <w:t xml:space="preserve"> account </w:t>
       </w:r>
     </w:p>
     <w:p>
@@ -3435,8 +3683,13 @@
       <w:r>
         <w:t xml:space="preserve">4. Now open another tab and copy the </w:t>
       </w:r>
-      <w:r>
-        <w:t xml:space="preserve">url for payment page  </w:t>
+      <w:proofErr w:type="spellStart"/>
+      <w:r>
+        <w:t>url</w:t>
+      </w:r>
+      <w:proofErr w:type="spellEnd"/>
+      <w:r>
+        <w:t xml:space="preserve"> for payment page  </w:t>
       </w:r>
     </w:p>
     <w:p>

</xml_diff>